<commit_message>
Let each person agree on their own, and mark the model field by field
Every party now also answers _o and _a, the endings of words that agree with
that person alone: inscrit{{.locatario_1_o}} and portador{{.locatario_1_a}}
read inscrito/inscrita/inscrito(a) and portador/portadora/portador(a). The
role's own _o could not do this once two people of different genders share a
role. 443 fields, catalogue and OpenAPI 0.8.1 updated.

The marked model in modelos/ no longer takes the qualification paragraph
whole: each party is written in the model's own wording, field by field, with
the CIN in place of the original's RG. docgen's engine filled it and Word read
the result back with the agreement right for a man and a woman.

Co-Authored-By: Claude Opus 5 <noreply@anthropic.com>
</commit_message>
<xml_diff>
--- a/modelos/contrato-de-locacao-marcado.docx
+++ b/modelos/contrato-de-locacao-marcado.docx
@@ -107,7 +107,7 @@
           <w:szCs w:val="28"/>
           <w:highlight w:val="yellow"/>
         </w:rPr>
-        <w:t xml:space="preserve">{{.locador_qualificacao}}.</w:t>
+        <w:t xml:space="preserve">{{.locador_1_nome}}, {{.locador_1_nacionalidade}}, {{.locador_1_estado_civil}}, {{.locador_1_profissao}}, portador{{.locador_1_a}} da Carteira de Identidade Nacional (CIN) n.º {{.locador_1_cin}}, inscrit{{.locador_1_o}} no CPF sob o n.º {{.locador_1_cpf}}, residente e domiciliad{{.locador_1_o}} à {{.locador_1_endereco}}.</w:t>
       </w:r>
     </w:p>
     <w:p>
@@ -164,7 +164,7 @@
           <w:szCs w:val="28"/>
           <w:highlight w:val="yellow"/>
         </w:rPr>
-        <w:t xml:space="preserve">{{.locatario_qualificacao}}.</w:t>
+        <w:t xml:space="preserve">{{.locatario_1_nome}}, {{.locatario_1_nacionalidade}}, {{.locatario_1_estado_civil}}, {{.locatario_1_profissao}}, portador{{.locatario_1_a}} da Carteira de Identidade Nacional (CIN) n.º {{.locatario_1_cin}}, inscrit{{.locatario_1_o}} no CPF sob o n.º {{.locatario_1_cpf}}, residente e domiciliad{{.locatario_1_o}} à {{.locatario_1_endereco}}.</w:t>
       </w:r>
     </w:p>
     <w:p>
@@ -2735,7 +2735,7 @@
           <w:szCs w:val="28"/>
           <w:highlight w:val="yellow"/>
         </w:rPr>
-        <w:t xml:space="preserve">{{.locador_nome}}</w:t>
+        <w:t xml:space="preserve">{{.locador_1_nome}}</w:t>
       </w:r>
     </w:p>
     <w:p>
@@ -2812,7 +2812,7 @@
           <w:szCs w:val="28"/>
           <w:highlight w:val="yellow"/>
         </w:rPr>
-        <w:t xml:space="preserve">{{.locatario_nome}}</w:t>
+        <w:t xml:space="preserve">{{.locatario_1_nome}}</w:t>
       </w:r>
     </w:p>
     <w:p>

</xml_diff>